<commit_message>
Refresh research on eight earlier sheets; rebuild all reference sheets
Agility, Turning Point Action (both), Flock (both), A1, OMG, and Envy
Pools had hit the search limit; each now has 6-7 cited pros and cons.
Every reference sheet is rebuilt with the Reddit search link and the
stacked pros/cons layout.

Co-Authored-By: Claude Opus 5.5 <noreply@anthropic.com>
Claude-Session: https://claude.ai/code/session_01VpCXqDFSAKkK8y6mKL2HCw
</commit_message>
<xml_diff>
--- a/Job Hunt 2026/2026-07-17 - Omni Advertising - Regional Automotive Video Editor/Job Description & Company Research - Omni Advertising.docx
+++ b/Job Hunt 2026/2026-07-17 - Omni Advertising - Regional Automotive Video Editor/Job Description & Company Research - Omni Advertising.docx
@@ -44,7 +44,7 @@
         </w:rPr>
         <w:t xml:space="preserve">APPLY:  </w:t>
       </w:r>
-      <w:hyperlink w:history="1" r:id="rIdpqf0kmluuai0popyu-g83">
+      <w:hyperlink w:history="1" r:id="rIdpdp1jh8fsftn_8rokyphs">
         <w:r>
           <w:rPr>
             <w:rFonts w:ascii="Calibri" w:cs="Calibri" w:eastAsia="Calibri" w:hAnsi="Calibri"/>
@@ -1485,7 +1485,7 @@
         </w:rPr>
         <w:t xml:space="preserve"> </w:t>
       </w:r>
-      <w:hyperlink w:history="1" r:id="rIdwpcpzhy4kn9cecdrnzzip">
+      <w:hyperlink w:history="1" r:id="rIdfbp-bd_f9eqqpi2xbhxek">
         <w:r>
           <w:rPr>
             <w:rFonts w:ascii="Calibri" w:cs="Calibri" w:eastAsia="Calibri" w:hAnsi="Calibri"/>
@@ -1547,7 +1547,7 @@
         </w:rPr>
         <w:t xml:space="preserve"> </w:t>
       </w:r>
-      <w:hyperlink w:history="1" r:id="rIdrxngehhhwg7ernvxbeqbr">
+      <w:hyperlink w:history="1" r:id="rIdoztvjj07sp1rw2clvxdkz">
         <w:r>
           <w:rPr>
             <w:rFonts w:ascii="Calibri" w:cs="Calibri" w:eastAsia="Calibri" w:hAnsi="Calibri"/>
@@ -1578,17 +1578,29 @@
     </w:p>
     <w:p>
       <w:pPr>
-        <w:spacing w:after="100" w:line="264"/>
-      </w:pPr>
-      <w:r>
-        <w:rPr>
-          <w:rFonts w:ascii="Calibri" w:cs="Calibri" w:eastAsia="Calibri" w:hAnsi="Calibri"/>
-          <w:color w:val="1A1A1A"/>
-          <w:sz w:val="21"/>
-          <w:szCs w:val="21"/>
-        </w:rPr>
-        <w:t xml:space="preserve">No Reddit discussion of Omni Advertising (the Boca Raton auto agency) turned up. The only Reddit-related hits were about Omnicom's internal 'Omni' platform, which is a different company.</w:t>
-      </w:r>
+        <w:spacing w:after="100"/>
+      </w:pPr>
+      <w:r>
+        <w:rPr>
+          <w:rFonts w:ascii="Calibri" w:cs="Calibri" w:eastAsia="Calibri" w:hAnsi="Calibri"/>
+          <w:color w:val="1A1A1A"/>
+          <w:sz w:val="21"/>
+          <w:szCs w:val="21"/>
+        </w:rPr>
+        <w:t xml:space="preserve">Reddit could not be searched for this sheet: Reddit blocks the automated search Claude uses. Open the link to read what people say there. </w:t>
+      </w:r>
+      <w:hyperlink w:history="1" r:id="rIdsw8z_xxc3-8uyk9zdsgmm">
+        <w:r>
+          <w:rPr>
+            <w:rFonts w:ascii="Calibri" w:cs="Calibri" w:eastAsia="Calibri" w:hAnsi="Calibri"/>
+            <w:color w:val="1A4D8F"/>
+            <w:sz w:val="21"/>
+            <w:szCs w:val="21"/>
+            <w:u w:val="single"/>
+          </w:rPr>
+          <w:t xml:space="preserve">Search Reddit for Omni Advertising</w:t>
+        </w:r>
+      </w:hyperlink>
     </w:p>
     <w:p>
       <w:pPr>
@@ -1652,7 +1664,7 @@
         </w:rPr>
         <w:t xml:space="preserve"> </w:t>
       </w:r>
-      <w:hyperlink w:history="1" r:id="rIdnchyprc7pirojkwzhkkty">
+      <w:hyperlink w:history="1" r:id="rIdpnrkkn49lrvhzuqtpmrnv">
         <w:r>
           <w:rPr>
             <w:rFonts w:ascii="Calibri" w:cs="Calibri" w:eastAsia="Calibri" w:hAnsi="Calibri"/>
@@ -1672,7 +1684,7 @@
         </w:rPr>
         <w:t xml:space="preserve"> </w:t>
       </w:r>
-      <w:hyperlink w:history="1" r:id="rIdvqmauol9qw7zjqbqmhrnd">
+      <w:hyperlink w:history="1" r:id="rId2rf-3tcrv-0wnz44jif2j">
         <w:r>
           <w:rPr>
             <w:rFonts w:ascii="Calibri" w:cs="Calibri" w:eastAsia="Calibri" w:hAnsi="Calibri"/>
@@ -1711,7 +1723,7 @@
         </w:rPr>
         <w:t xml:space="preserve"> </w:t>
       </w:r>
-      <w:hyperlink w:history="1" r:id="rId10hj-rfgmmo3tb3ftswu1">
+      <w:hyperlink w:history="1" r:id="rIdgsld1crrdqca_m9s9m_yn">
         <w:r>
           <w:rPr>
             <w:rFonts w:ascii="Calibri" w:cs="Calibri" w:eastAsia="Calibri" w:hAnsi="Calibri"/>
@@ -1731,7 +1743,7 @@
         </w:rPr>
         <w:t xml:space="preserve"> </w:t>
       </w:r>
-      <w:hyperlink w:history="1" r:id="rIdqztmh7zdopzvwuhhwydxl">
+      <w:hyperlink w:history="1" r:id="rIdgl2-7zz4ylzpxwlk6anyz">
         <w:r>
           <w:rPr>
             <w:rFonts w:ascii="Calibri" w:cs="Calibri" w:eastAsia="Calibri" w:hAnsi="Calibri"/>
@@ -1770,7 +1782,7 @@
         </w:rPr>
         <w:t xml:space="preserve"> </w:t>
       </w:r>
-      <w:hyperlink w:history="1" r:id="rIdfgrvblywymgssr9a0x3gz">
+      <w:hyperlink w:history="1" r:id="rId4ovigon4i4arbhmvaguob">
         <w:r>
           <w:rPr>
             <w:rFonts w:ascii="Calibri" w:cs="Calibri" w:eastAsia="Calibri" w:hAnsi="Calibri"/>
@@ -1809,7 +1821,7 @@
         </w:rPr>
         <w:t xml:space="preserve"> </w:t>
       </w:r>
-      <w:hyperlink w:history="1" r:id="rIds3xqbvem92mocq5-4huyn">
+      <w:hyperlink w:history="1" r:id="rIdfu8slp4hayfdq-gmrmyar">
         <w:r>
           <w:rPr>
             <w:rFonts w:ascii="Calibri" w:cs="Calibri" w:eastAsia="Calibri" w:hAnsi="Calibri"/>
@@ -1829,7 +1841,7 @@
         </w:rPr>
         <w:t xml:space="preserve"> </w:t>
       </w:r>
-      <w:hyperlink w:history="1" r:id="rIdkqodbq34pygfjjqiknhhl">
+      <w:hyperlink w:history="1" r:id="rIdamdjgz17xy2mswskmtscc">
         <w:r>
           <w:rPr>
             <w:rFonts w:ascii="Calibri" w:cs="Calibri" w:eastAsia="Calibri" w:hAnsi="Calibri"/>
@@ -1868,7 +1880,7 @@
         </w:rPr>
         <w:t xml:space="preserve"> </w:t>
       </w:r>
-      <w:hyperlink w:history="1" r:id="rIdbabzchltfrjmep_3z3omw">
+      <w:hyperlink w:history="1" r:id="rIdw4-7gsrk7q652q7pwmscv">
         <w:r>
           <w:rPr>
             <w:rFonts w:ascii="Calibri" w:cs="Calibri" w:eastAsia="Calibri" w:hAnsi="Calibri"/>
@@ -1907,7 +1919,7 @@
         </w:rPr>
         <w:t xml:space="preserve"> </w:t>
       </w:r>
-      <w:hyperlink w:history="1" r:id="rIds99widlbpnmhumd6azyyy">
+      <w:hyperlink w:history="1" r:id="rIdzgs_2o9cbh8da5orvmcch">
         <w:r>
           <w:rPr>
             <w:rFonts w:ascii="Calibri" w:cs="Calibri" w:eastAsia="Calibri" w:hAnsi="Calibri"/>
@@ -1927,7 +1939,7 @@
         </w:rPr>
         <w:t xml:space="preserve"> </w:t>
       </w:r>
-      <w:hyperlink w:history="1" r:id="rId-fovcus1komgsy9lnafqo">
+      <w:hyperlink w:history="1" r:id="rIdntw1h5t3ath56z4rubqpi">
         <w:r>
           <w:rPr>
             <w:rFonts w:ascii="Calibri" w:cs="Calibri" w:eastAsia="Calibri" w:hAnsi="Calibri"/>
@@ -1982,7 +1994,7 @@
         </w:rPr>
         <w:t xml:space="preserve"> </w:t>
       </w:r>
-      <w:hyperlink w:history="1" r:id="rId2atz60tawp3iomq1offw4">
+      <w:hyperlink w:history="1" r:id="rIdr_d6j-7tbtsfecpy4-ome">
         <w:r>
           <w:rPr>
             <w:rFonts w:ascii="Calibri" w:cs="Calibri" w:eastAsia="Calibri" w:hAnsi="Calibri"/>
@@ -2002,7 +2014,7 @@
         </w:rPr>
         <w:t xml:space="preserve"> </w:t>
       </w:r>
-      <w:hyperlink w:history="1" r:id="rIdv4kbhsmsxo0v8xqvrhbtr">
+      <w:hyperlink w:history="1" r:id="rIdo1ta_3wdsypey2kqsqbl5">
         <w:r>
           <w:rPr>
             <w:rFonts w:ascii="Calibri" w:cs="Calibri" w:eastAsia="Calibri" w:hAnsi="Calibri"/>
@@ -2041,7 +2053,7 @@
         </w:rPr>
         <w:t xml:space="preserve"> </w:t>
       </w:r>
-      <w:hyperlink w:history="1" r:id="rId4jionq50bnh2qusr99omn">
+      <w:hyperlink w:history="1" r:id="rIdcedocldzqw8fbdwp_qhy3">
         <w:r>
           <w:rPr>
             <w:rFonts w:ascii="Calibri" w:cs="Calibri" w:eastAsia="Calibri" w:hAnsi="Calibri"/>
@@ -2061,7 +2073,7 @@
         </w:rPr>
         <w:t xml:space="preserve"> </w:t>
       </w:r>
-      <w:hyperlink w:history="1" r:id="rIdaecoywzzgfvlafzxvzr-e">
+      <w:hyperlink w:history="1" r:id="rIdyqel2x9i4vlo0hxmftxzx">
         <w:r>
           <w:rPr>
             <w:rFonts w:ascii="Calibri" w:cs="Calibri" w:eastAsia="Calibri" w:hAnsi="Calibri"/>
@@ -2100,7 +2112,7 @@
         </w:rPr>
         <w:t xml:space="preserve"> </w:t>
       </w:r>
-      <w:hyperlink w:history="1" r:id="rIdxmuqxnrgvlvsjkq2txnd3">
+      <w:hyperlink w:history="1" r:id="rIdaj6l8ctulkvbudjq_yif7">
         <w:r>
           <w:rPr>
             <w:rFonts w:ascii="Calibri" w:cs="Calibri" w:eastAsia="Calibri" w:hAnsi="Calibri"/>
@@ -2120,7 +2132,7 @@
         </w:rPr>
         <w:t xml:space="preserve"> </w:t>
       </w:r>
-      <w:hyperlink w:history="1" r:id="rIdklz0sgz1ogkqbd1rwfiyc">
+      <w:hyperlink w:history="1" r:id="rId41-uwsgum0cypkh1etpo4">
         <w:r>
           <w:rPr>
             <w:rFonts w:ascii="Calibri" w:cs="Calibri" w:eastAsia="Calibri" w:hAnsi="Calibri"/>
@@ -2159,7 +2171,7 @@
         </w:rPr>
         <w:t xml:space="preserve"> </w:t>
       </w:r>
-      <w:hyperlink w:history="1" r:id="rIdjlboiuqyu2kohwjdz1qmy">
+      <w:hyperlink w:history="1" r:id="rIdmdfb8ovge0o4a41276vn7">
         <w:r>
           <w:rPr>
             <w:rFonts w:ascii="Calibri" w:cs="Calibri" w:eastAsia="Calibri" w:hAnsi="Calibri"/>
@@ -2198,7 +2210,7 @@
         </w:rPr>
         <w:t xml:space="preserve"> </w:t>
       </w:r>
-      <w:hyperlink w:history="1" r:id="rId_rlwvd6hgnnerno6qdikf">
+      <w:hyperlink w:history="1" r:id="rIdtatihhqxkz81uzshocwsr">
         <w:r>
           <w:rPr>
             <w:rFonts w:ascii="Calibri" w:cs="Calibri" w:eastAsia="Calibri" w:hAnsi="Calibri"/>
@@ -2218,7 +2230,7 @@
         </w:rPr>
         <w:t xml:space="preserve"> </w:t>
       </w:r>
-      <w:hyperlink w:history="1" r:id="rIduryrmdqszbuzib9psve3y">
+      <w:hyperlink w:history="1" r:id="rIdqeul1kjyhe37xofgpkmrz">
         <w:r>
           <w:rPr>
             <w:rFonts w:ascii="Calibri" w:cs="Calibri" w:eastAsia="Calibri" w:hAnsi="Calibri"/>
@@ -2257,7 +2269,7 @@
         </w:rPr>
         <w:t xml:space="preserve"> </w:t>
       </w:r>
-      <w:hyperlink w:history="1" r:id="rId6w6gd9kis7wbuwddskr_j">
+      <w:hyperlink w:history="1" r:id="rIdgnmkkta3ofsb1c4lus-dp">
         <w:r>
           <w:rPr>
             <w:rFonts w:ascii="Calibri" w:cs="Calibri" w:eastAsia="Calibri" w:hAnsi="Calibri"/>
@@ -2438,7 +2450,7 @@
         </w:numPr>
         <w:spacing w:after="50" w:line="259"/>
       </w:pPr>
-      <w:hyperlink w:history="1" r:id="rIdq9u3o9zvtzyt4sdbn1wgo">
+      <w:hyperlink w:history="1" r:id="rIdvyayl70xakhsr01lvx8sx">
         <w:r>
           <w:rPr>
             <w:rFonts w:ascii="Calibri" w:cs="Calibri" w:eastAsia="Calibri" w:hAnsi="Calibri"/>
@@ -2469,7 +2481,7 @@
         </w:numPr>
         <w:spacing w:after="50" w:line="259"/>
       </w:pPr>
-      <w:hyperlink w:history="1" r:id="rId-eokbi61a_r4-itnpcjut">
+      <w:hyperlink w:history="1" r:id="rIdijufaiduf87n3qowuqk9a">
         <w:r>
           <w:rPr>
             <w:rFonts w:ascii="Calibri" w:cs="Calibri" w:eastAsia="Calibri" w:hAnsi="Calibri"/>
@@ -2500,7 +2512,7 @@
         </w:numPr>
         <w:spacing w:after="50" w:line="259"/>
       </w:pPr>
-      <w:hyperlink w:history="1" r:id="rIderuemkxah5vghozxiq-r-">
+      <w:hyperlink w:history="1" r:id="rIdxotrcljoiazayay7j9xid">
         <w:r>
           <w:rPr>
             <w:rFonts w:ascii="Calibri" w:cs="Calibri" w:eastAsia="Calibri" w:hAnsi="Calibri"/>
@@ -2531,7 +2543,7 @@
         </w:numPr>
         <w:spacing w:after="50" w:line="259"/>
       </w:pPr>
-      <w:hyperlink w:history="1" r:id="rIdew1xo-qbkmcmqudrkr2hu">
+      <w:hyperlink w:history="1" r:id="rIdf5xsoeqoas11fjmhrxiwm">
         <w:r>
           <w:rPr>
             <w:rFonts w:ascii="Calibri" w:cs="Calibri" w:eastAsia="Calibri" w:hAnsi="Calibri"/>
@@ -2562,7 +2574,7 @@
         </w:numPr>
         <w:spacing w:after="50" w:line="259"/>
       </w:pPr>
-      <w:hyperlink w:history="1" r:id="rId8mzotwdwegp-o5y56pg8n">
+      <w:hyperlink w:history="1" r:id="rIdpqu7lessd5uqnfgf5aqvh">
         <w:r>
           <w:rPr>
             <w:rFonts w:ascii="Calibri" w:cs="Calibri" w:eastAsia="Calibri" w:hAnsi="Calibri"/>
@@ -2593,7 +2605,7 @@
         </w:numPr>
         <w:spacing w:after="50" w:line="259"/>
       </w:pPr>
-      <w:hyperlink w:history="1" r:id="rIdm2unlls0mm6yg4ujhyfqx">
+      <w:hyperlink w:history="1" r:id="rIdwguihnfvfj6pvq_eekwuj">
         <w:r>
           <w:rPr>
             <w:rFonts w:ascii="Calibri" w:cs="Calibri" w:eastAsia="Calibri" w:hAnsi="Calibri"/>
@@ -2624,7 +2636,7 @@
         </w:numPr>
         <w:spacing w:after="50" w:line="259"/>
       </w:pPr>
-      <w:hyperlink w:history="1" r:id="rIdo-g1gkn90cdqsltll5suy">
+      <w:hyperlink w:history="1" r:id="rIdyjzoin75ra-g5chgzydzc">
         <w:r>
           <w:rPr>
             <w:rFonts w:ascii="Calibri" w:cs="Calibri" w:eastAsia="Calibri" w:hAnsi="Calibri"/>
@@ -2655,7 +2667,7 @@
         </w:numPr>
         <w:spacing w:after="50" w:line="259"/>
       </w:pPr>
-      <w:hyperlink w:history="1" r:id="rId2ncsoxsdfbflkac8d7pe5">
+      <w:hyperlink w:history="1" r:id="rIdxc7ee4onkqabepzjvwhuo">
         <w:r>
           <w:rPr>
             <w:rFonts w:ascii="Calibri" w:cs="Calibri" w:eastAsia="Calibri" w:hAnsi="Calibri"/>

</xml_diff>